<commit_message>
margin update on mspp template
</commit_message>
<xml_diff>
--- a/public/templates/MSP Pentesting - Engine Template.docx
+++ b/public/templates/MSP Pentesting - Engine Template.docx
@@ -1352,7 +1352,7 @@
     </w:p>
     <w:sdt>
       <w:sdtPr>
-        <w:id w:val="970493707"/>
+        <w:id w:val="1435947759"/>
         <w:docPartObj>
           <w:docPartGallery w:val="Table of Contents"/>
           <w:docPartUnique w:val="1"/>
@@ -4705,10 +4705,12 @@
         <w:pStyle w:val="Heading2"/>
         <w:widowControl w:val="1"/>
         <w:spacing w:line="276" w:lineRule="auto"/>
-        <w:ind w:right="1440"/>
+        <w:ind w:left="0" w:right="0" w:firstLine="0"/>
         <w:jc w:val="both"/>
         <w:rPr>
           <w:rFonts w:ascii="Chakra Petch Medium" w:cs="Chakra Petch Medium" w:eastAsia="Chakra Petch Medium" w:hAnsi="Chakra Petch Medium"/>
+          <w:sz w:val="36"/>
+          <w:szCs w:val="36"/>
         </w:rPr>
       </w:pPr>
       <w:bookmarkStart w:colFirst="0" w:colLast="0" w:name="_ymqqm7624jp2" w:id="17"/>
@@ -4716,6 +4718,8 @@
       <w:r>
         <w:rPr>
           <w:rFonts w:ascii="Chakra Petch Medium" w:cs="Chakra Petch Medium" w:eastAsia="Chakra Petch Medium" w:hAnsi="Chakra Petch Medium"/>
+          <w:sz w:val="36"/>
+          <w:szCs w:val="36"/>
           <w:rtl w:val="0"/>
         </w:rPr>
         <w:t xml:space="preserve">{{#findings}}</w:t>
@@ -4726,10 +4730,12 @@
         <w:pStyle w:val="Heading2"/>
         <w:widowControl w:val="1"/>
         <w:spacing w:line="276" w:lineRule="auto"/>
-        <w:ind w:right="1440"/>
+        <w:ind w:left="0" w:right="0" w:hanging="15"/>
         <w:jc w:val="both"/>
         <w:rPr>
           <w:rFonts w:ascii="Chakra Petch Medium" w:cs="Chakra Petch Medium" w:eastAsia="Chakra Petch Medium" w:hAnsi="Chakra Petch Medium"/>
+          <w:sz w:val="36"/>
+          <w:szCs w:val="36"/>
         </w:rPr>
       </w:pPr>
       <w:bookmarkStart w:colFirst="0" w:colLast="0" w:name="_agxjgj2gfs02" w:id="18"/>
@@ -4737,14 +4743,11 @@
       <w:r>
         <w:rPr>
           <w:rFonts w:ascii="Chakra Petch Medium" w:cs="Chakra Petch Medium" w:eastAsia="Chakra Petch Medium" w:hAnsi="Chakra Petch Medium"/>
+          <w:sz w:val="36"/>
+          <w:szCs w:val="36"/>
           <w:rtl w:val="0"/>
         </w:rPr>
         <w:t xml:space="preserve">01-{{index}}-{{title}}</w:t>
-      </w:r>
-      <w:r>
-        <w:rPr>
-          <w:rtl w:val="0"/>
-        </w:rPr>
       </w:r>
     </w:p>
     <w:p>

</xml_diff>

<commit_message>
chore: update MSP Pentesting engine template (page breaks + edits)
</commit_message>
<xml_diff>
--- a/public/templates/MSP Pentesting - Engine Template.docx
+++ b/public/templates/MSP Pentesting - Engine Template.docx
@@ -1352,7 +1352,7 @@
     </w:p>
     <w:sdt>
       <w:sdtPr>
-        <w:id w:val="1435947759"/>
+        <w:id w:val="-1390161500"/>
         <w:docPartObj>
           <w:docPartGallery w:val="Table of Contents"/>
           <w:docPartUnique w:val="1"/>
@@ -3363,15 +3363,10 @@
     </w:p>
     <w:p>
       <w:pPr>
-        <w:pStyle w:val="Heading1"/>
         <w:spacing w:line="240" w:lineRule="auto"/>
         <w:ind w:left="1440" w:right="1440" w:firstLine="0"/>
-        <w:rPr>
-          <w:rFonts w:ascii="Chakra Petch Medium" w:cs="Chakra Petch Medium" w:eastAsia="Chakra Petch Medium" w:hAnsi="Chakra Petch Medium"/>
-        </w:rPr>
-      </w:pPr>
-      <w:bookmarkStart w:colFirst="0" w:colLast="0" w:name="_e2shhpy2j5aq" w:id="10"/>
-      <w:bookmarkEnd w:id="10"/>
+        <w:rPr/>
+      </w:pPr>
       <w:r>
         <w:br w:type="page"/>
       </w:r>
@@ -3434,8 +3429,8 @@
           <w:rFonts w:ascii="Chakra Petch Medium" w:cs="Chakra Petch Medium" w:eastAsia="Chakra Petch Medium" w:hAnsi="Chakra Petch Medium"/>
         </w:rPr>
       </w:pPr>
-      <w:bookmarkStart w:colFirst="0" w:colLast="0" w:name="_ygrt02ygmn29" w:id="11"/>
-      <w:bookmarkEnd w:id="11"/>
+      <w:bookmarkStart w:colFirst="0" w:colLast="0" w:name="_ygrt02ygmn29" w:id="10"/>
+      <w:bookmarkEnd w:id="10"/>
       <w:r>
         <w:rPr>
           <w:rFonts w:ascii="Chakra Petch Medium" w:cs="Chakra Petch Medium" w:eastAsia="Chakra Petch Medium" w:hAnsi="Chakra Petch Medium"/>
@@ -3545,8 +3540,8 @@
           <w:rFonts w:ascii="Chakra Petch Medium" w:cs="Chakra Petch Medium" w:eastAsia="Chakra Petch Medium" w:hAnsi="Chakra Petch Medium"/>
         </w:rPr>
       </w:pPr>
-      <w:bookmarkStart w:colFirst="0" w:colLast="0" w:name="_uviieyizfgwr" w:id="12"/>
-      <w:bookmarkEnd w:id="12"/>
+      <w:bookmarkStart w:colFirst="0" w:colLast="0" w:name="_uviieyizfgwr" w:id="11"/>
+      <w:bookmarkEnd w:id="11"/>
       <w:r>
         <w:rPr>
           <w:rFonts w:ascii="Chakra Petch Medium" w:cs="Chakra Petch Medium" w:eastAsia="Chakra Petch Medium" w:hAnsi="Chakra Petch Medium"/>
@@ -3653,8 +3648,8 @@
           <w:rFonts w:ascii="Chakra Petch Medium" w:cs="Chakra Petch Medium" w:eastAsia="Chakra Petch Medium" w:hAnsi="Chakra Petch Medium"/>
         </w:rPr>
       </w:pPr>
-      <w:bookmarkStart w:colFirst="0" w:colLast="0" w:name="_vfr7yihimo4t" w:id="13"/>
-      <w:bookmarkEnd w:id="13"/>
+      <w:bookmarkStart w:colFirst="0" w:colLast="0" w:name="_vfr7yihimo4t" w:id="12"/>
+      <w:bookmarkEnd w:id="12"/>
       <w:r>
         <w:rPr>
           <w:rFonts w:ascii="Chakra Petch Medium" w:cs="Chakra Petch Medium" w:eastAsia="Chakra Petch Medium" w:hAnsi="Chakra Petch Medium"/>
@@ -3737,8 +3732,8 @@
           <w:bCs w:val="1"/>
         </w:rPr>
       </w:pPr>
-      <w:bookmarkStart w:colFirst="0" w:colLast="0" w:name="_ymk0gp9ydfh6" w:id="14"/>
-      <w:bookmarkEnd w:id="14"/>
+      <w:bookmarkStart w:colFirst="0" w:colLast="0" w:name="_ymk0gp9ydfh6" w:id="13"/>
+      <w:bookmarkEnd w:id="13"/>
       <w:r>
         <w:rPr>
           <w:rFonts w:ascii="Chakra Petch Medium" w:cs="Chakra Petch Medium" w:eastAsia="Chakra Petch Medium" w:hAnsi="Chakra Petch Medium"/>
@@ -4659,8 +4654,8 @@
           <w:bCs w:val="1"/>
         </w:rPr>
       </w:pPr>
-      <w:bookmarkStart w:colFirst="0" w:colLast="0" w:name="_t8mtx43clubo" w:id="15"/>
-      <w:bookmarkEnd w:id="15"/>
+      <w:bookmarkStart w:colFirst="0" w:colLast="0" w:name="_t8mtx43clubo" w:id="14"/>
+      <w:bookmarkEnd w:id="14"/>
       <w:r>
         <w:br w:type="page"/>
       </w:r>
@@ -4683,8 +4678,8 @@
           <w:szCs w:val="48"/>
         </w:rPr>
       </w:pPr>
-      <w:bookmarkStart w:colFirst="0" w:colLast="0" w:name="_jopdqhyu5plk" w:id="16"/>
-      <w:bookmarkEnd w:id="16"/>
+      <w:bookmarkStart w:colFirst="0" w:colLast="0" w:name="_jopdqhyu5plk" w:id="15"/>
+      <w:bookmarkEnd w:id="15"/>
       <w:r>
         <w:rPr>
           <w:rFonts w:ascii="Chakra Petch" w:cs="Chakra Petch" w:eastAsia="Chakra Petch" w:hAnsi="Chakra Petch"/>
@@ -4713,8 +4708,8 @@
           <w:szCs w:val="36"/>
         </w:rPr>
       </w:pPr>
-      <w:bookmarkStart w:colFirst="0" w:colLast="0" w:name="_ymqqm7624jp2" w:id="17"/>
-      <w:bookmarkEnd w:id="17"/>
+      <w:bookmarkStart w:colFirst="0" w:colLast="0" w:name="_ymqqm7624jp2" w:id="16"/>
+      <w:bookmarkEnd w:id="16"/>
       <w:r>
         <w:rPr>
           <w:rFonts w:ascii="Chakra Petch Medium" w:cs="Chakra Petch Medium" w:eastAsia="Chakra Petch Medium" w:hAnsi="Chakra Petch Medium"/>
@@ -4723,6 +4718,30 @@
           <w:rtl w:val="0"/>
         </w:rPr>
         <w:t xml:space="preserve">{{#findings}}</w:t>
+      </w:r>
+    </w:p>
+    <w:p>
+      <w:pPr>
+        <w:pStyle w:val="Heading2"/>
+        <w:widowControl w:val="1"/>
+        <w:spacing w:line="276" w:lineRule="auto"/>
+        <w:ind w:left="0" w:right="0" w:hanging="15"/>
+        <w:jc w:val="both"/>
+        <w:rPr>
+          <w:rFonts w:ascii="Chakra Petch Medium" w:cs="Chakra Petch Medium" w:eastAsia="Chakra Petch Medium" w:hAnsi="Chakra Petch Medium"/>
+          <w:sz w:val="36"/>
+          <w:szCs w:val="36"/>
+        </w:rPr>
+      </w:pPr>
+      <w:bookmarkStart w:colFirst="0" w:colLast="0" w:name="_hjiyguchgxuy" w:id="17"/>
+      <w:bookmarkEnd w:id="17"/>
+      <w:r>
+        <w:br w:type="page"/>
+      </w:r>
+      <w:r>
+        <w:rPr>
+          <w:rtl w:val="0"/>
+        </w:rPr>
       </w:r>
     </w:p>
     <w:p>

</xml_diff>